<commit_message>
Add lesson plan for Menerapkan Prinsip Komunikasi dalam Dunia Desain (MD & DOCX)
</commit_message>
<xml_diff>
--- a/lesson-plans/lessonplan_pertemuan22.docx
+++ b/lesson-plans/lessonplan_pertemuan22.docx
@@ -179,9 +179,28 @@
             <w:vAlign w:val="center"/>
           </w:tcPr>
           <w:p>
+            <w:pPr>
+              <w:spacing w:before="60" w:after="60"/>
+              <w:rPr>
+                <w:rFonts w:ascii="Tahoma" w:eastAsia="Tahoma" w:hAnsi="Tahoma" w:cs="Tahoma"/>
+                <w:b/>
+                <w:sz w:val="22"/>
+                <w:szCs w:val="22"/>
+                <w:lang w:val="en-US"/>
+              </w:rPr>
+            </w:pPr>
+            <w:proofErr w:type="spellStart"/>
             <w:r>
+              <w:rPr>
+                <w:rFonts w:ascii="Tahoma" w:eastAsia="Tahoma" w:hAnsi="Tahoma" w:cs="Tahoma"/>
+                <w:b/>
+                <w:sz w:val="22"/>
+                <w:szCs w:val="22"/>
+                <w:lang w:val="en-US"/>
+              </w:rPr>
               <w:t>Kejuruan</w:t>
             </w:r>
+            <w:proofErr w:type="spellEnd"/>
           </w:p>
         </w:tc>
         <w:tc>
@@ -194,7 +213,22 @@
             <w:vAlign w:val="center"/>
           </w:tcPr>
           <w:p>
+            <w:pPr>
+              <w:spacing w:before="60" w:after="60"/>
+              <w:rPr>
+                <w:rFonts w:ascii="Tahoma" w:eastAsia="Tahoma" w:hAnsi="Tahoma" w:cs="Tahoma"/>
+                <w:b/>
+                <w:sz w:val="22"/>
+                <w:szCs w:val="22"/>
+              </w:rPr>
+            </w:pPr>
             <w:r>
+              <w:rPr>
+                <w:rFonts w:ascii="Tahoma" w:eastAsia="Tahoma" w:hAnsi="Tahoma" w:cs="Tahoma"/>
+                <w:b/>
+                <w:sz w:val="22"/>
+                <w:szCs w:val="22"/>
+              </w:rPr>
               <w:t>:</w:t>
             </w:r>
           </w:p>
@@ -289,7 +323,7 @@
           </w:tcPr>
           <w:p>
             <w:r>
-              <w:t>Unit Akhir</w:t>
+              <w:t>M.74DKV13.012.2</w:t>
             </w:r>
           </w:p>
         </w:tc>
@@ -303,7 +337,22 @@
             <w:vAlign w:val="center"/>
           </w:tcPr>
           <w:p>
+            <w:pPr>
+              <w:spacing w:before="60" w:after="60"/>
+              <w:rPr>
+                <w:rFonts w:ascii="Tahoma" w:eastAsia="Tahoma" w:hAnsi="Tahoma" w:cs="Tahoma"/>
+                <w:b/>
+                <w:sz w:val="22"/>
+                <w:szCs w:val="22"/>
+              </w:rPr>
+            </w:pPr>
             <w:r>
+              <w:rPr>
+                <w:rFonts w:ascii="Tahoma" w:eastAsia="Tahoma" w:hAnsi="Tahoma" w:cs="Tahoma"/>
+                <w:b/>
+                <w:sz w:val="22"/>
+                <w:szCs w:val="22"/>
+              </w:rPr>
               <w:t>Penyajian ke</w:t>
             </w:r>
           </w:p>
@@ -318,7 +367,22 @@
             <w:vAlign w:val="center"/>
           </w:tcPr>
           <w:p>
+            <w:pPr>
+              <w:spacing w:before="60" w:after="60"/>
+              <w:rPr>
+                <w:rFonts w:ascii="Tahoma" w:eastAsia="Tahoma" w:hAnsi="Tahoma" w:cs="Tahoma"/>
+                <w:b/>
+                <w:sz w:val="22"/>
+                <w:szCs w:val="22"/>
+              </w:rPr>
+            </w:pPr>
             <w:r>
+              <w:rPr>
+                <w:rFonts w:ascii="Tahoma" w:eastAsia="Tahoma" w:hAnsi="Tahoma" w:cs="Tahoma"/>
+                <w:b/>
+                <w:sz w:val="22"/>
+                <w:szCs w:val="22"/>
+              </w:rPr>
               <w:t>:</w:t>
             </w:r>
           </w:p>
@@ -413,7 +477,7 @@
           </w:tcPr>
           <w:p>
             <w:r>
-              <w:t>Portofolio &amp; Karir DKV</w:t>
+              <w:t>Menciptakan Karya Desain</w:t>
             </w:r>
           </w:p>
         </w:tc>
@@ -427,8 +491,23 @@
             <w:vAlign w:val="center"/>
           </w:tcPr>
           <w:p>
+            <w:pPr>
+              <w:spacing w:before="60" w:after="60"/>
+              <w:rPr>
+                <w:rFonts w:ascii="Tahoma" w:eastAsia="Tahoma" w:hAnsi="Tahoma" w:cs="Tahoma"/>
+                <w:b/>
+                <w:sz w:val="22"/>
+                <w:szCs w:val="22"/>
+              </w:rPr>
+            </w:pPr>
             <w:r>
-              <w:t>Waktu</w:t>
+              <w:rPr>
+                <w:rFonts w:ascii="Tahoma" w:eastAsia="Tahoma" w:hAnsi="Tahoma" w:cs="Tahoma"/>
+                <w:b/>
+                <w:sz w:val="22"/>
+                <w:szCs w:val="22"/>
+              </w:rPr>
+              <w:t xml:space="preserve">Waktu </w:t>
             </w:r>
           </w:p>
         </w:tc>
@@ -442,7 +521,22 @@
             <w:vAlign w:val="center"/>
           </w:tcPr>
           <w:p>
+            <w:pPr>
+              <w:spacing w:before="60" w:after="60"/>
+              <w:rPr>
+                <w:rFonts w:ascii="Tahoma" w:eastAsia="Tahoma" w:hAnsi="Tahoma" w:cs="Tahoma"/>
+                <w:b/>
+                <w:sz w:val="22"/>
+                <w:szCs w:val="22"/>
+              </w:rPr>
+            </w:pPr>
             <w:r>
+              <w:rPr>
+                <w:rFonts w:ascii="Tahoma" w:eastAsia="Tahoma" w:hAnsi="Tahoma" w:cs="Tahoma"/>
+                <w:b/>
+                <w:sz w:val="22"/>
+                <w:szCs w:val="22"/>
+              </w:rPr>
               <w:t>:</w:t>
             </w:r>
           </w:p>
@@ -471,7 +565,7 @@
           </w:tcPr>
           <w:p>
             <w:r>
-              <w:t>Penyusunan Portofolio Desain Grafis Profesional (PDF &amp; Online Behance/PDF)</w:t>
+              <w:t>Menerapkan Prinsip Komunikasi dalam Dunia Desain</w:t>
             </w:r>
           </w:p>
         </w:tc>
@@ -484,7 +578,7 @@
           </w:tcPr>
           <w:p>
             <w:r>
-              <w:t>Setelah selesai mengikuti pelatihan ini peserta kompeten dalam mengurasi karya terbaik, menyusun Layout Portofolio PDF, dan mempublikasikannya ke platform portofolio online.</w:t>
+              <w:t>Tujuan Pembelajaran  : Setelah selesai mengikuti pelatihan ini peserta kompeten dalam memahami dan menerapkan prinsip komunikasi visual secara efektif, menguasai hierarki visual, pemilihan warna, tipografi, serta penggunaan ruang kosong (negative space) dalam merancang pesan desain yang komunikatif.</w:t>
             </w:r>
           </w:p>
         </w:tc>
@@ -504,7 +598,23 @@
             </w:tcBorders>
           </w:tcPr>
           <w:p>
+            <w:pPr>
+              <w:spacing w:before="120"/>
+              <w:jc w:val="both"/>
+              <w:rPr>
+                <w:rFonts w:ascii="Tahoma" w:eastAsia="Tahoma" w:hAnsi="Tahoma" w:cs="Tahoma"/>
+                <w:b/>
+                <w:sz w:val="22"/>
+                <w:szCs w:val="22"/>
+              </w:rPr>
+            </w:pPr>
             <w:r>
+              <w:rPr>
+                <w:rFonts w:ascii="Tahoma" w:eastAsia="Tahoma" w:hAnsi="Tahoma" w:cs="Tahoma"/>
+                <w:b/>
+                <w:sz w:val="22"/>
+                <w:szCs w:val="22"/>
+              </w:rPr>
               <w:t>Metode Mengajar</w:t>
             </w:r>
           </w:p>
@@ -516,11 +626,7 @@
           </w:tcPr>
           <w:p>
             <w:r>
-              <w:t>Ceramah</w:t>
-              <w:br/>
-              <w:t>Demonstrasi</w:t>
-              <w:br/>
-              <w:t>Praktikum</w:t>
+              <w:t>Ceramah Diskusi Praktikum</w:t>
             </w:r>
           </w:p>
         </w:tc>
@@ -538,12 +644,54 @@
             <w:vMerge w:val="restart"/>
           </w:tcPr>
           <w:p>
+            <w:pPr>
+              <w:spacing w:before="120"/>
+              <w:jc w:val="both"/>
+              <w:rPr>
+                <w:rFonts w:ascii="Tahoma" w:eastAsia="Tahoma" w:hAnsi="Tahoma" w:cs="Tahoma"/>
+                <w:b/>
+                <w:sz w:val="22"/>
+                <w:szCs w:val="22"/>
+              </w:rPr>
+            </w:pPr>
             <w:r>
+              <w:rPr>
+                <w:rFonts w:ascii="Tahoma" w:eastAsia="Tahoma" w:hAnsi="Tahoma" w:cs="Tahoma"/>
+                <w:b/>
+                <w:sz w:val="22"/>
+                <w:szCs w:val="22"/>
+              </w:rPr>
               <w:t>Media Pembelajaran</w:t>
-              <w:br/>
+            </w:r>
+          </w:p>
+          <w:p>
+            <w:pPr>
+              <w:jc w:val="both"/>
+              <w:rPr>
+                <w:rFonts w:ascii="Tahoma" w:eastAsia="Tahoma" w:hAnsi="Tahoma" w:cs="Tahoma"/>
+                <w:sz w:val="22"/>
+                <w:szCs w:val="22"/>
+              </w:rPr>
+            </w:pPr>
+            <w:r>
+              <w:rPr>
+                <w:rFonts w:ascii="Tahoma" w:eastAsia="Tahoma" w:hAnsi="Tahoma" w:cs="Tahoma"/>
+                <w:sz w:val="22"/>
+                <w:szCs w:val="22"/>
+              </w:rPr>
               <w:t>(Media, Alat, Bahan)</w:t>
             </w:r>
           </w:p>
+          <w:p>
+            <w:pPr>
+              <w:jc w:val="both"/>
+              <w:rPr>
+                <w:rFonts w:ascii="Tahoma" w:eastAsia="Tahoma" w:hAnsi="Tahoma" w:cs="Tahoma"/>
+                <w:sz w:val="22"/>
+                <w:szCs w:val="22"/>
+              </w:rPr>
+            </w:pPr>
+          </w:p>
         </w:tc>
         <w:tc>
           <w:tcPr>
@@ -552,7 +700,7 @@
           </w:tcPr>
           <w:p>
             <w:r>
-              <w:t>Media Power Point &amp; Contoh Portofolio Desainer Grafis Profesional (PDF &amp; Behance)</w:t>
+              <w:t>Power Point &amp; Contoh Desain Komunikasi Visual</w:t>
             </w:r>
           </w:p>
         </w:tc>
@@ -589,7 +737,7 @@
           </w:tcPr>
           <w:p>
             <w:r>
-              <w:t>Alat Proyektor dan Layar, Perangkat Komputer / Workstation Lab, Papan Tulis, Spidol dan Penghapus</w:t>
+              <w:t>Proyektor, Layar, Workstation Lab, Papan Tulis, Spidol</w:t>
             </w:r>
           </w:p>
         </w:tc>
@@ -629,7 +777,7 @@
           </w:tcPr>
           <w:p>
             <w:r>
-              <w:t>Flashdisk, File Karya Terbaik Peserta (Meeting 1 - 21)</w:t>
+              <w:t>Flashdisk, Lembar Jobsheet</w:t>
             </w:r>
           </w:p>
         </w:tc>
@@ -672,9 +820,21 @@
             <w:gridSpan w:val="6"/>
           </w:tcPr>
           <w:p>
-            <w:r>
-              <w:t>Persiapan</w:t>
-            </w:r>
+            <w:pPr>
+              <w:numPr>
+                <w:ilvl w:val="0"/>
+                <w:numId w:val="5"/>
+              </w:numPr>
+              <w:spacing w:after="120" w:line="276" w:lineRule="auto"/>
+              <w:ind w:left="294" w:hanging="284"/>
+              <w:jc w:val="both"/>
+              <w:rPr>
+                <w:rFonts w:ascii="Tahoma" w:eastAsia="Tahoma" w:hAnsi="Tahoma" w:cs="Tahoma"/>
+                <w:color w:val="000000" w:themeColor="text1"/>
+                <w:sz w:val="22"/>
+                <w:szCs w:val="22"/>
+              </w:rPr>
+            </w:pPr>
           </w:p>
         </w:tc>
       </w:tr>
@@ -721,16 +881,20 @@
             <w:vMerge w:val="restart"/>
           </w:tcPr>
           <w:p>
+            <w:pPr>
+              <w:rPr>
+                <w:rFonts w:ascii="Tahoma" w:eastAsia="Tahoma" w:hAnsi="Tahoma" w:cs="Tahoma"/>
+                <w:sz w:val="22"/>
+                <w:szCs w:val="22"/>
+              </w:rPr>
+            </w:pPr>
             <w:r>
-              <w:t>1. Memberi salam dan Memperkenalkan diri</w:t>
-              <w:br/>
-              <w:t>2. Mengabsen peserta pelatihan</w:t>
-              <w:br/>
-              <w:t>3. Menjelaskan safety induction lab TIK</w:t>
-              <w:br/>
-              <w:t>4. Apersepsi: Portofolio sebagai bukti nyata kompetensi dan senjata utama melamar kerja / mendapat klien</w:t>
-              <w:br/>
-              <w:t>5. Menyampaikan judul unit dan tujuan materi portofolio</w:t>
+              <w:rPr>
+                <w:rFonts w:ascii="Tahoma" w:eastAsia="Tahoma" w:hAnsi="Tahoma" w:cs="Tahoma"/>
+                <w:sz w:val="22"/>
+                <w:szCs w:val="22"/>
+              </w:rPr>
+              <w:t>1</w:t>
             </w:r>
           </w:p>
         </w:tc>
@@ -739,7 +903,24 @@
             <w:tcW w:w="1850" w:type="dxa"/>
           </w:tcPr>
           <w:p>
+            <w:pPr>
+              <w:spacing w:before="120" w:after="120"/>
+              <w:ind w:left="26"/>
+              <w:jc w:val="center"/>
+              <w:rPr>
+                <w:rFonts w:ascii="Tahoma" w:eastAsia="Tahoma" w:hAnsi="Tahoma" w:cs="Tahoma"/>
+                <w:b/>
+                <w:sz w:val="22"/>
+                <w:szCs w:val="22"/>
+              </w:rPr>
+            </w:pPr>
             <w:r>
+              <w:rPr>
+                <w:rFonts w:ascii="Tahoma" w:eastAsia="Tahoma" w:hAnsi="Tahoma" w:cs="Tahoma"/>
+                <w:b/>
+                <w:sz w:val="22"/>
+                <w:szCs w:val="22"/>
+              </w:rPr>
               <w:t>Perkiraan Waktu</w:t>
             </w:r>
           </w:p>
@@ -806,9 +987,15 @@
             <w:tcW w:w="1850" w:type="dxa"/>
           </w:tcPr>
           <w:p>
-            <w:r>
-              <w:t>10 menit</w:t>
-            </w:r>
+            <w:pPr>
+              <w:ind w:left="26"/>
+              <w:jc w:val="center"/>
+              <w:rPr>
+                <w:rFonts w:ascii="Tahoma" w:eastAsia="Tahoma" w:hAnsi="Tahoma" w:cs="Tahoma"/>
+                <w:sz w:val="22"/>
+                <w:szCs w:val="22"/>
+              </w:rPr>
+            </w:pPr>
           </w:p>
         </w:tc>
       </w:tr>
@@ -827,7 +1014,25 @@
             <w:vAlign w:val="center"/>
           </w:tcPr>
           <w:p>
+            <w:pPr>
+              <w:pStyle w:val="ListParagraph"/>
+              <w:numPr>
+                <w:ilvl w:val="0"/>
+                <w:numId w:val="6"/>
+              </w:numPr>
+              <w:spacing w:before="120" w:after="120"/>
+              <w:ind w:left="294" w:hanging="284"/>
+              <w:jc w:val="both"/>
+              <w:rPr>
+                <w:rFonts w:ascii="Tahoma" w:eastAsia="Tahoma" w:hAnsi="Tahoma" w:cs="Tahoma"/>
+                <w:i/>
+              </w:rPr>
+            </w:pPr>
             <w:r>
+              <w:rPr>
+                <w:rFonts w:ascii="Tahoma" w:eastAsia="Tahoma" w:hAnsi="Tahoma" w:cs="Tahoma"/>
+                <w:b/>
+              </w:rPr>
               <w:t>Penyajian</w:t>
             </w:r>
           </w:p>
@@ -913,9 +1118,46 @@
             <w:vAlign w:val="center"/>
           </w:tcPr>
           <w:p>
+            <w:pPr>
+              <w:jc w:val="center"/>
+              <w:rPr>
+                <w:rFonts w:ascii="Tahoma" w:eastAsia="Tahoma" w:hAnsi="Tahoma" w:cs="Tahoma"/>
+                <w:b/>
+                <w:sz w:val="22"/>
+                <w:szCs w:val="22"/>
+              </w:rPr>
+            </w:pPr>
+          </w:p>
+          <w:p>
+            <w:pPr>
+              <w:jc w:val="center"/>
+              <w:rPr>
+                <w:rFonts w:ascii="Tahoma" w:eastAsia="Tahoma" w:hAnsi="Tahoma" w:cs="Tahoma"/>
+                <w:b/>
+                <w:sz w:val="22"/>
+                <w:szCs w:val="22"/>
+              </w:rPr>
+            </w:pPr>
             <w:r>
+              <w:rPr>
+                <w:rFonts w:ascii="Tahoma" w:eastAsia="Tahoma" w:hAnsi="Tahoma" w:cs="Tahoma"/>
+                <w:b/>
+                <w:sz w:val="22"/>
+                <w:szCs w:val="22"/>
+              </w:rPr>
               <w:t>Sub Judul</w:t>
             </w:r>
+          </w:p>
+          <w:p>
+            <w:pPr>
+              <w:jc w:val="center"/>
+              <w:rPr>
+                <w:rFonts w:ascii="Tahoma" w:eastAsia="Tahoma" w:hAnsi="Tahoma" w:cs="Tahoma"/>
+                <w:i/>
+                <w:sz w:val="22"/>
+                <w:szCs w:val="22"/>
+              </w:rPr>
+            </w:pPr>
           </w:p>
         </w:tc>
         <w:tc>
@@ -925,9 +1167,46 @@
             <w:vAlign w:val="center"/>
           </w:tcPr>
           <w:p>
+            <w:pPr>
+              <w:jc w:val="center"/>
+              <w:rPr>
+                <w:rFonts w:ascii="Tahoma" w:eastAsia="Tahoma" w:hAnsi="Tahoma" w:cs="Tahoma"/>
+                <w:b/>
+                <w:sz w:val="22"/>
+                <w:szCs w:val="22"/>
+              </w:rPr>
+            </w:pPr>
+          </w:p>
+          <w:p>
+            <w:pPr>
+              <w:jc w:val="center"/>
+              <w:rPr>
+                <w:rFonts w:ascii="Tahoma" w:eastAsia="Tahoma" w:hAnsi="Tahoma" w:cs="Tahoma"/>
+                <w:b/>
+                <w:sz w:val="22"/>
+                <w:szCs w:val="22"/>
+              </w:rPr>
+            </w:pPr>
             <w:r>
+              <w:rPr>
+                <w:rFonts w:ascii="Tahoma" w:eastAsia="Tahoma" w:hAnsi="Tahoma" w:cs="Tahoma"/>
+                <w:b/>
+                <w:sz w:val="22"/>
+                <w:szCs w:val="22"/>
+              </w:rPr>
               <w:t>Uraian Kegiatan</w:t>
             </w:r>
+          </w:p>
+          <w:p>
+            <w:pPr>
+              <w:jc w:val="center"/>
+              <w:rPr>
+                <w:rFonts w:ascii="Tahoma" w:eastAsia="Tahoma" w:hAnsi="Tahoma" w:cs="Tahoma"/>
+                <w:i/>
+                <w:sz w:val="22"/>
+                <w:szCs w:val="22"/>
+              </w:rPr>
+            </w:pPr>
           </w:p>
         </w:tc>
         <w:tc>
@@ -937,7 +1216,21 @@
             <w:vAlign w:val="center"/>
           </w:tcPr>
           <w:p>
+            <w:pPr>
+              <w:jc w:val="center"/>
+              <w:rPr>
+                <w:rFonts w:ascii="Tahoma" w:eastAsia="Tahoma" w:hAnsi="Tahoma" w:cs="Tahoma"/>
+                <w:sz w:val="22"/>
+                <w:szCs w:val="22"/>
+              </w:rPr>
+            </w:pPr>
             <w:r>
+              <w:rPr>
+                <w:rFonts w:ascii="Tahoma" w:eastAsia="Tahoma" w:hAnsi="Tahoma" w:cs="Tahoma"/>
+                <w:b/>
+                <w:sz w:val="22"/>
+                <w:szCs w:val="22"/>
+              </w:rPr>
               <w:t>Media Pembelajaran</w:t>
             </w:r>
           </w:p>
@@ -948,8 +1241,32 @@
             <w:vAlign w:val="center"/>
           </w:tcPr>
           <w:p>
+            <w:pPr>
+              <w:jc w:val="center"/>
+              <w:rPr>
+                <w:rFonts w:ascii="Tahoma" w:eastAsia="Tahoma" w:hAnsi="Tahoma" w:cs="Tahoma"/>
+                <w:i/>
+                <w:sz w:val="22"/>
+                <w:szCs w:val="22"/>
+              </w:rPr>
+            </w:pPr>
             <w:r>
+              <w:rPr>
+                <w:rFonts w:ascii="Tahoma" w:eastAsia="Tahoma" w:hAnsi="Tahoma" w:cs="Tahoma"/>
+                <w:b/>
+                <w:sz w:val="22"/>
+                <w:szCs w:val="22"/>
+              </w:rPr>
               <w:t>Perkiraan Waktu</w:t>
+            </w:r>
+            <w:r>
+              <w:rPr>
+                <w:rFonts w:ascii="Tahoma" w:eastAsia="Tahoma" w:hAnsi="Tahoma" w:cs="Tahoma"/>
+                <w:i/>
+                <w:sz w:val="22"/>
+                <w:szCs w:val="22"/>
+              </w:rPr>
+              <w:t xml:space="preserve"> </w:t>
             </w:r>
           </w:p>
         </w:tc>
@@ -966,9 +1283,72 @@
             <w:gridSpan w:val="3"/>
           </w:tcPr>
           <w:p>
+            <w:pPr>
+              <w:pStyle w:val="ListParagraph"/>
+              <w:numPr>
+                <w:ilvl w:val="3"/>
+                <w:numId w:val="5"/>
+              </w:numPr>
+              <w:spacing w:before="60"/>
+              <w:ind w:left="292"/>
+              <w:rPr>
+                <w:rFonts w:ascii="Tahoma" w:eastAsia="Tahoma" w:hAnsi="Tahoma" w:cs="Tahoma"/>
+                <w:b/>
+              </w:rPr>
+            </w:pPr>
             <w:r>
-              <w:t>Struktur Portofolio &amp; Kurasi Karya Terbaik</w:t>
+              <w:rPr>
+                <w:rFonts w:ascii="Tahoma" w:eastAsia="Tahoma" w:hAnsi="Tahoma" w:cs="Tahoma"/>
+                <w:b/>
+              </w:rPr>
+              <w:t>Dasar-dasar Copywriting</w:t>
             </w:r>
+          </w:p>
+          <w:p>
+            <w:pPr>
+              <w:spacing w:before="60"/>
+              <w:rPr>
+                <w:rFonts w:ascii="Tahoma" w:eastAsia="Tahoma" w:hAnsi="Tahoma" w:cs="Tahoma"/>
+                <w:b/>
+              </w:rPr>
+            </w:pPr>
+          </w:p>
+          <w:p>
+            <w:pPr>
+              <w:spacing w:before="60"/>
+              <w:rPr>
+                <w:rFonts w:ascii="Tahoma" w:eastAsia="Tahoma" w:hAnsi="Tahoma" w:cs="Tahoma"/>
+                <w:b/>
+              </w:rPr>
+            </w:pPr>
+          </w:p>
+          <w:p>
+            <w:pPr>
+              <w:spacing w:before="60"/>
+              <w:rPr>
+                <w:rFonts w:ascii="Tahoma" w:eastAsia="Tahoma" w:hAnsi="Tahoma" w:cs="Tahoma"/>
+                <w:b/>
+              </w:rPr>
+            </w:pPr>
+          </w:p>
+          <w:p>
+            <w:pPr>
+              <w:spacing w:before="60"/>
+              <w:rPr>
+                <w:rFonts w:ascii="Tahoma" w:eastAsia="Tahoma" w:hAnsi="Tahoma" w:cs="Tahoma"/>
+                <w:b/>
+              </w:rPr>
+            </w:pPr>
+          </w:p>
+          <w:p>
+            <w:pPr>
+              <w:pStyle w:val="ListParagraph"/>
+              <w:spacing w:before="60"/>
+              <w:rPr>
+                <w:rFonts w:ascii="Tahoma" w:eastAsia="Tahoma" w:hAnsi="Tahoma" w:cs="Tahoma"/>
+                <w:b/>
+              </w:rPr>
+            </w:pPr>
           </w:p>
         </w:tc>
         <w:tc>
@@ -977,17 +1357,26 @@
             <w:gridSpan w:val="2"/>
           </w:tcPr>
           <w:p>
-            <w:r>
-              <w:t>Instruktur menjelaskan kepada peserta terkait:</w:t>
-              <w:br/>
-              <w:t>- Struktur Portofolio: About Me (Profil), Services, Selected Works (Studi Kasus), dan Contacts</w:t>
-              <w:br/>
-              <w:t>- Cara menuliskan deskripsi Studi Kasus (Problem, Solution, My Role, dan Deliverables)</w:t>
-              <w:br/>
-              <w:t>- Mengurasi karya: Memilih 3-5 karya terbaik (Quality over Quantity)</w:t>
-              <w:br/>
-              <w:t>Instruktur membuka sesi tanya jawab.</w:t>
-            </w:r>
+            <w:pPr>
+              <w:pStyle w:val="ListParagraph"/>
+              <w:numPr>
+                <w:ilvl w:val="0"/>
+                <w:numId w:val="4"/>
+              </w:numPr>
+              <w:pBdr>
+                <w:top w:val="nil"/>
+                <w:left w:val="nil"/>
+                <w:bottom w:val="nil"/>
+                <w:right w:val="nil"/>
+                <w:between w:val="nil"/>
+              </w:pBdr>
+              <w:spacing w:before="60"/>
+              <w:ind w:left="171" w:right="89" w:hanging="283"/>
+              <w:rPr>
+                <w:rFonts w:ascii="Tahoma" w:eastAsia="Tahoma" w:hAnsi="Tahoma" w:cs="Tahoma"/>
+                <w:color w:val="000000"/>
+              </w:rPr>
+            </w:pPr>
           </w:p>
         </w:tc>
         <w:tc>
@@ -996,9 +1385,23 @@
             <w:gridSpan w:val="3"/>
           </w:tcPr>
           <w:p>
-            <w:r>
-              <w:t>Power Point &amp; Portfolio Examples</w:t>
-            </w:r>
+            <w:pPr>
+              <w:pBdr>
+                <w:top w:val="nil"/>
+                <w:left w:val="nil"/>
+                <w:bottom w:val="nil"/>
+                <w:right w:val="nil"/>
+                <w:between w:val="nil"/>
+              </w:pBdr>
+              <w:spacing w:before="60" w:line="276" w:lineRule="auto"/>
+              <w:ind w:left="253" w:right="89"/>
+              <w:rPr>
+                <w:rFonts w:ascii="Tahoma" w:eastAsia="Tahoma" w:hAnsi="Tahoma" w:cs="Tahoma"/>
+                <w:color w:val="000000"/>
+                <w:sz w:val="22"/>
+                <w:szCs w:val="22"/>
+              </w:rPr>
+            </w:pPr>
           </w:p>
         </w:tc>
         <w:tc>
@@ -1006,9 +1409,15 @@
             <w:tcW w:w="1850" w:type="dxa"/>
           </w:tcPr>
           <w:p>
-            <w:r>
-              <w:t>35 menit</w:t>
-            </w:r>
+            <w:pPr>
+              <w:spacing w:before="60"/>
+              <w:jc w:val="center"/>
+              <w:rPr>
+                <w:rFonts w:ascii="Tahoma" w:eastAsia="Tahoma" w:hAnsi="Tahoma" w:cs="Tahoma"/>
+                <w:sz w:val="22"/>
+                <w:szCs w:val="22"/>
+              </w:rPr>
+            </w:pPr>
           </w:p>
         </w:tc>
       </w:tr>
@@ -1024,8 +1433,25 @@
             <w:gridSpan w:val="3"/>
           </w:tcPr>
           <w:p>
+            <w:pPr>
+              <w:pStyle w:val="ListParagraph"/>
+              <w:numPr>
+                <w:ilvl w:val="3"/>
+                <w:numId w:val="5"/>
+              </w:numPr>
+              <w:spacing w:before="60"/>
+              <w:ind w:left="292"/>
+              <w:rPr>
+                <w:rFonts w:ascii="Tahoma" w:eastAsia="Tahoma" w:hAnsi="Tahoma" w:cs="Tahoma"/>
+                <w:b/>
+              </w:rPr>
+            </w:pPr>
             <w:r>
-              <w:t>Demonstrasi Layouting Portofolio PDF &amp; Behance</w:t>
+              <w:rPr>
+                <w:rFonts w:ascii="Tahoma" w:eastAsia="Tahoma" w:hAnsi="Tahoma" w:cs="Tahoma"/>
+                <w:b/>
+              </w:rPr>
+              <w:t>Pengenalan Tools AI ( ChatGPT dan Canva AI)</w:t>
             </w:r>
           </w:p>
         </w:tc>
@@ -1035,15 +1461,27 @@
             <w:gridSpan w:val="2"/>
           </w:tcPr>
           <w:p>
-            <w:r>
-              <w:t>Instruktur mendemonstrasikan kepada peserta terkait:</w:t>
-              <w:br/>
-              <w:t>- Pembuatan dokumen Portofolio PDF lanskap (16:9) yang rapi dan elegan</w:t>
-              <w:br/>
-              <w:t>- Cara mengunggah (upload) projek studi kasus ke situs Behance / LinkedIn</w:t>
-              <w:br/>
-              <w:t>- Tanya jawab interaktif bersama peserta.</w:t>
-            </w:r>
+            <w:pPr>
+              <w:numPr>
+                <w:ilvl w:val="0"/>
+                <w:numId w:val="4"/>
+              </w:numPr>
+              <w:pBdr>
+                <w:top w:val="nil"/>
+                <w:left w:val="nil"/>
+                <w:bottom w:val="nil"/>
+                <w:right w:val="nil"/>
+                <w:between w:val="nil"/>
+              </w:pBdr>
+              <w:spacing w:before="60" w:line="276" w:lineRule="auto"/>
+              <w:ind w:left="171" w:right="89" w:hanging="283"/>
+              <w:rPr>
+                <w:rFonts w:ascii="Tahoma" w:eastAsia="Tahoma" w:hAnsi="Tahoma" w:cs="Tahoma"/>
+                <w:color w:val="000000"/>
+                <w:sz w:val="22"/>
+                <w:szCs w:val="22"/>
+              </w:rPr>
+            </w:pPr>
           </w:p>
         </w:tc>
         <w:tc>
@@ -1052,9 +1490,23 @@
             <w:gridSpan w:val="3"/>
           </w:tcPr>
           <w:p>
-            <w:r>
-              <w:t>Software Grafis &amp; Screen Projector</w:t>
-            </w:r>
+            <w:pPr>
+              <w:pBdr>
+                <w:top w:val="nil"/>
+                <w:left w:val="nil"/>
+                <w:bottom w:val="nil"/>
+                <w:right w:val="nil"/>
+                <w:between w:val="nil"/>
+              </w:pBdr>
+              <w:spacing w:before="60" w:line="276" w:lineRule="auto"/>
+              <w:ind w:left="253" w:right="89"/>
+              <w:rPr>
+                <w:rFonts w:ascii="Tahoma" w:eastAsia="Tahoma" w:hAnsi="Tahoma" w:cs="Tahoma"/>
+                <w:color w:val="000000"/>
+                <w:sz w:val="22"/>
+                <w:szCs w:val="22"/>
+              </w:rPr>
+            </w:pPr>
           </w:p>
         </w:tc>
         <w:tc>
@@ -1062,9 +1514,15 @@
             <w:tcW w:w="1850" w:type="dxa"/>
           </w:tcPr>
           <w:p>
-            <w:r>
-              <w:t>35 menit</w:t>
-            </w:r>
+            <w:pPr>
+              <w:spacing w:before="60"/>
+              <w:jc w:val="center"/>
+              <w:rPr>
+                <w:rFonts w:ascii="Tahoma" w:eastAsia="Tahoma" w:hAnsi="Tahoma" w:cs="Tahoma"/>
+                <w:sz w:val="22"/>
+                <w:szCs w:val="22"/>
+              </w:rPr>
+            </w:pPr>
           </w:p>
         </w:tc>
       </w:tr>
@@ -1080,8 +1538,25 @@
             <w:gridSpan w:val="3"/>
           </w:tcPr>
           <w:p>
+            <w:pPr>
+              <w:pStyle w:val="ListParagraph"/>
+              <w:numPr>
+                <w:ilvl w:val="3"/>
+                <w:numId w:val="5"/>
+              </w:numPr>
+              <w:spacing w:before="60"/>
+              <w:ind w:left="292"/>
+              <w:rPr>
+                <w:rFonts w:ascii="Tahoma" w:eastAsia="Tahoma" w:hAnsi="Tahoma" w:cs="Tahoma"/>
+                <w:b/>
+              </w:rPr>
+            </w:pPr>
             <w:r>
-              <w:t>Praktik Mandiri: Menyusun Dokumen Portofolio PDF</w:t>
+              <w:rPr>
+                <w:rFonts w:ascii="Tahoma" w:eastAsia="Tahoma" w:hAnsi="Tahoma" w:cs="Tahoma"/>
+                <w:b/>
+              </w:rPr>
+              <w:t>Batasan dan Etika dalam menggunakan AI</w:t>
             </w:r>
           </w:p>
         </w:tc>
@@ -1091,15 +1566,27 @@
             <w:gridSpan w:val="2"/>
           </w:tcPr>
           <w:p>
-            <w:r>
-              <w:t>Instruktur memberikan jobsheet dan mendampingi peserta untuk:</w:t>
-              <w:br/>
-              <w:t>- Merancang dokumen Portofolio PDF minimal 6-8 halaman berisi karya-karya terbaik selama pelatihan</w:t>
-              <w:br/>
-              <w:t>- Menata gambar mockup hasil karya dan teks penjelasan studi kasusnya</w:t>
-              <w:br/>
-              <w:t>- Instruktur berkeliling memberikan bimbingan teknis.</w:t>
-            </w:r>
+            <w:pPr>
+              <w:numPr>
+                <w:ilvl w:val="0"/>
+                <w:numId w:val="4"/>
+              </w:numPr>
+              <w:pBdr>
+                <w:top w:val="nil"/>
+                <w:left w:val="nil"/>
+                <w:bottom w:val="nil"/>
+                <w:right w:val="nil"/>
+                <w:between w:val="nil"/>
+              </w:pBdr>
+              <w:spacing w:before="60" w:line="276" w:lineRule="auto"/>
+              <w:ind w:left="171" w:right="89" w:hanging="283"/>
+              <w:rPr>
+                <w:rFonts w:ascii="Tahoma" w:eastAsia="Tahoma" w:hAnsi="Tahoma" w:cs="Tahoma"/>
+                <w:color w:val="000000"/>
+                <w:sz w:val="22"/>
+                <w:szCs w:val="22"/>
+              </w:rPr>
+            </w:pPr>
           </w:p>
         </w:tc>
         <w:tc>
@@ -1108,9 +1595,23 @@
             <w:gridSpan w:val="3"/>
           </w:tcPr>
           <w:p>
-            <w:r>
-              <w:t>PC Lab &amp; Asset Karya (Jobsheet 22)</w:t>
-            </w:r>
+            <w:pPr>
+              <w:pBdr>
+                <w:top w:val="nil"/>
+                <w:left w:val="nil"/>
+                <w:bottom w:val="nil"/>
+                <w:right w:val="nil"/>
+                <w:between w:val="nil"/>
+              </w:pBdr>
+              <w:spacing w:before="60" w:line="276" w:lineRule="auto"/>
+              <w:ind w:left="253" w:right="89"/>
+              <w:rPr>
+                <w:rFonts w:ascii="Tahoma" w:eastAsia="Tahoma" w:hAnsi="Tahoma" w:cs="Tahoma"/>
+                <w:color w:val="000000"/>
+                <w:sz w:val="22"/>
+                <w:szCs w:val="22"/>
+              </w:rPr>
+            </w:pPr>
           </w:p>
         </w:tc>
         <w:tc>
@@ -1118,9 +1619,15 @@
             <w:tcW w:w="1850" w:type="dxa"/>
           </w:tcPr>
           <w:p>
-            <w:r>
-              <w:t>35 menit</w:t>
-            </w:r>
+            <w:pPr>
+              <w:spacing w:before="60"/>
+              <w:jc w:val="center"/>
+              <w:rPr>
+                <w:rFonts w:ascii="Tahoma" w:eastAsia="Tahoma" w:hAnsi="Tahoma" w:cs="Tahoma"/>
+                <w:sz w:val="22"/>
+                <w:szCs w:val="22"/>
+              </w:rPr>
+            </w:pPr>
           </w:p>
         </w:tc>
       </w:tr>
@@ -1136,7 +1643,24 @@
             <w:gridSpan w:val="3"/>
           </w:tcPr>
           <w:p>
+            <w:pPr>
+              <w:pStyle w:val="ListParagraph"/>
+              <w:numPr>
+                <w:ilvl w:val="3"/>
+                <w:numId w:val="5"/>
+              </w:numPr>
+              <w:spacing w:before="60"/>
+              <w:ind w:left="292"/>
+              <w:rPr>
+                <w:rFonts w:ascii="Tahoma" w:eastAsia="Tahoma" w:hAnsi="Tahoma" w:cs="Tahoma"/>
+                <w:b/>
+              </w:rPr>
+            </w:pPr>
             <w:r>
+              <w:rPr>
+                <w:rFonts w:ascii="Tahoma" w:eastAsia="Tahoma" w:hAnsi="Tahoma" w:cs="Tahoma"/>
+                <w:b/>
+              </w:rPr>
               <w:t>Kesimpulan ( Summary)</w:t>
             </w:r>
           </w:p>
@@ -1147,9 +1671,27 @@
             <w:gridSpan w:val="2"/>
           </w:tcPr>
           <w:p>
-            <w:r>
-              <w:t>Instruktur menyimpulkan pentingnya menampilkan proses berpikir (sketsa &amp; konsep) di dalam portofolio, bukan hanya hasil akhir.</w:t>
-            </w:r>
+            <w:pPr>
+              <w:numPr>
+                <w:ilvl w:val="0"/>
+                <w:numId w:val="4"/>
+              </w:numPr>
+              <w:pBdr>
+                <w:top w:val="nil"/>
+                <w:left w:val="nil"/>
+                <w:bottom w:val="nil"/>
+                <w:right w:val="nil"/>
+                <w:between w:val="nil"/>
+              </w:pBdr>
+              <w:spacing w:before="60" w:line="276" w:lineRule="auto"/>
+              <w:ind w:left="171" w:right="89" w:hanging="283"/>
+              <w:rPr>
+                <w:rFonts w:ascii="Tahoma" w:eastAsia="Tahoma" w:hAnsi="Tahoma" w:cs="Tahoma"/>
+                <w:color w:val="000000"/>
+                <w:sz w:val="22"/>
+                <w:szCs w:val="22"/>
+              </w:rPr>
+            </w:pPr>
           </w:p>
         </w:tc>
         <w:tc>
@@ -1158,9 +1700,23 @@
             <w:gridSpan w:val="3"/>
           </w:tcPr>
           <w:p>
-            <w:r>
-              <w:t>Power Point</w:t>
-            </w:r>
+            <w:pPr>
+              <w:pBdr>
+                <w:top w:val="nil"/>
+                <w:left w:val="nil"/>
+                <w:bottom w:val="nil"/>
+                <w:right w:val="nil"/>
+                <w:between w:val="nil"/>
+              </w:pBdr>
+              <w:spacing w:before="60" w:line="276" w:lineRule="auto"/>
+              <w:ind w:left="253" w:right="89"/>
+              <w:rPr>
+                <w:rFonts w:ascii="Tahoma" w:eastAsia="Tahoma" w:hAnsi="Tahoma" w:cs="Tahoma"/>
+                <w:color w:val="000000"/>
+                <w:sz w:val="22"/>
+                <w:szCs w:val="22"/>
+              </w:rPr>
+            </w:pPr>
           </w:p>
         </w:tc>
         <w:tc>
@@ -1168,9 +1724,15 @@
             <w:tcW w:w="1850" w:type="dxa"/>
           </w:tcPr>
           <w:p>
-            <w:r>
-              <w:t>5 menit</w:t>
-            </w:r>
+            <w:pPr>
+              <w:spacing w:before="60"/>
+              <w:jc w:val="center"/>
+              <w:rPr>
+                <w:rFonts w:ascii="Tahoma" w:eastAsia="Tahoma" w:hAnsi="Tahoma" w:cs="Tahoma"/>
+                <w:sz w:val="22"/>
+                <w:szCs w:val="22"/>
+              </w:rPr>
+            </w:pPr>
           </w:p>
         </w:tc>
       </w:tr>
@@ -1187,7 +1749,25 @@
             <w:vAlign w:val="center"/>
           </w:tcPr>
           <w:p>
+            <w:pPr>
+              <w:pStyle w:val="ListParagraph"/>
+              <w:numPr>
+                <w:ilvl w:val="0"/>
+                <w:numId w:val="6"/>
+              </w:numPr>
+              <w:spacing w:before="120" w:after="120"/>
+              <w:ind w:left="436" w:hanging="426"/>
+              <w:jc w:val="both"/>
+              <w:rPr>
+                <w:rFonts w:ascii="Tahoma" w:eastAsia="Tahoma" w:hAnsi="Tahoma" w:cs="Tahoma"/>
+                <w:b/>
+              </w:rPr>
+            </w:pPr>
             <w:r>
+              <w:rPr>
+                <w:rFonts w:ascii="Tahoma" w:eastAsia="Tahoma" w:hAnsi="Tahoma" w:cs="Tahoma"/>
+                <w:b/>
+              </w:rPr>
               <w:t>Aplikasi</w:t>
             </w:r>
           </w:p>
@@ -1198,163 +1778,27 @@
             <w:gridSpan w:val="2"/>
           </w:tcPr>
           <w:p>
-            <w:r>
-              <w:t>Instruktur memberikan kuis interaktif tebak kesalahan fatal dalam menyusun portofolio lamaran kerja.</w:t>
-            </w:r>
-          </w:p>
-        </w:tc>
-        <w:tc>
-          <w:tcPr>
-            <w:tcW w:w="1796" w:type="dxa"/>
-            <w:gridSpan w:val="3"/>
-          </w:tcPr>
-          <w:p>
-            <w:r>
-              <w:t>Quizizz.com / Form</w:t>
-            </w:r>
-          </w:p>
-        </w:tc>
-        <w:tc>
-          <w:tcPr>
-            <w:tcW w:w="1850" w:type="dxa"/>
-          </w:tcPr>
-          <w:p>
-            <w:r>
-              <w:t>20 menit</w:t>
-            </w:r>
-          </w:p>
-        </w:tc>
-      </w:tr>
-      <w:tr>
-        <w:trPr>
-          <w:gridAfter w:val="1"/>
-          <w:wAfter w:w="10" w:type="dxa"/>
-          <w:trHeight w:val="306"/>
-        </w:trPr>
-        <w:tc>
-          <w:tcPr>
-            <w:tcW w:w="2665" w:type="dxa"/>
-            <w:gridSpan w:val="3"/>
-            <w:vAlign w:val="center"/>
-          </w:tcPr>
-          <w:p>
-            <w:r>
-              <w:t>Evaluasi</w:t>
-            </w:r>
-          </w:p>
-        </w:tc>
-        <w:tc>
-          <w:tcPr>
-            <w:tcW w:w="3543" w:type="dxa"/>
-            <w:gridSpan w:val="2"/>
-          </w:tcPr>
-          <w:p>
-            <w:r>
-              <w:t>Instruktur menilai kelengkapan dan estetika layout Portofolio PDF peserta pada Jobsheet 22.</w:t>
-            </w:r>
-          </w:p>
-        </w:tc>
-        <w:tc>
-          <w:tcPr>
-            <w:tcW w:w="1796" w:type="dxa"/>
-            <w:gridSpan w:val="3"/>
-          </w:tcPr>
-          <w:p>
-            <w:r>
-              <w:t>Lembar Jobsheet 22 &amp; Rubrik</w:t>
-            </w:r>
-          </w:p>
-        </w:tc>
-        <w:tc>
-          <w:tcPr>
-            <w:tcW w:w="1850" w:type="dxa"/>
-          </w:tcPr>
-          <w:p>
-            <w:r>
-              <w:t>30 menit</w:t>
-            </w:r>
-          </w:p>
-        </w:tc>
-      </w:tr>
-      <w:tr>
-        <w:trPr>
-          <w:gridAfter w:val="1"/>
-          <w:wAfter w:w="10" w:type="dxa"/>
-          <w:trHeight w:val="587"/>
-        </w:trPr>
-        <w:tc>
-          <w:tcPr>
-            <w:tcW w:w="2665" w:type="dxa"/>
-            <w:gridSpan w:val="3"/>
-            <w:vAlign w:val="center"/>
-          </w:tcPr>
-          <w:p>
-            <w:r>
-              <w:t>Tugas Tambahan</w:t>
-            </w:r>
-          </w:p>
-        </w:tc>
-        <w:tc>
-          <w:tcPr>
-            <w:tcW w:w="3543" w:type="dxa"/>
-            <w:gridSpan w:val="2"/>
-          </w:tcPr>
-          <w:p>
-            <w:r>
-              <w:t>Instruktur memberikan tugas tambahan: Melengkapi teks biodata dan kontak profesional pada dokumen portofolio.</w:t>
-            </w:r>
-          </w:p>
-        </w:tc>
-        <w:tc>
-          <w:tcPr>
-            <w:tcW w:w="1796" w:type="dxa"/>
-            <w:gridSpan w:val="3"/>
-          </w:tcPr>
-          <w:p>
-            <w:r>
-              <w:t>Instruktur memberikan tugas tambahan: Melengkapi teks biodata dan kontak profesional pada dokumen portofolio.</w:t>
-            </w:r>
-          </w:p>
-        </w:tc>
-        <w:tc>
-          <w:tcPr>
-            <w:tcW w:w="1850" w:type="dxa"/>
-          </w:tcPr>
-          <w:p>
-            <w:r>
-              <w:t>5 menit</w:t>
-            </w:r>
-          </w:p>
-        </w:tc>
-      </w:tr>
-      <w:tr>
-        <w:trPr>
-          <w:gridAfter w:val="1"/>
-          <w:wAfter w:w="10" w:type="dxa"/>
-        </w:trPr>
-        <w:tc>
-          <w:tcPr>
-            <w:tcW w:w="2665" w:type="dxa"/>
-            <w:gridSpan w:val="3"/>
-            <w:vAlign w:val="center"/>
-          </w:tcPr>
-          <w:p>
-            <w:r>
-              <w:t>Pemberesan Kelas</w:t>
-            </w:r>
-          </w:p>
-        </w:tc>
-        <w:tc>
-          <w:tcPr>
-            <w:tcW w:w="3543" w:type="dxa"/>
-            <w:gridSpan w:val="2"/>
-          </w:tcPr>
-          <w:p>
-            <w:r>
-              <w:t>Merapikan perangkat PC dan ruang lab (5R)</w:t>
-              <w:br/>
-              <w:t>Berdoa dan memberikan salam penutup</w:t>
-            </w:r>
+            <w:pPr>
+              <w:numPr>
+                <w:ilvl w:val="0"/>
+                <w:numId w:val="4"/>
+              </w:numPr>
+              <w:pBdr>
+                <w:top w:val="nil"/>
+                <w:left w:val="nil"/>
+                <w:bottom w:val="nil"/>
+                <w:right w:val="nil"/>
+                <w:between w:val="nil"/>
+              </w:pBdr>
+              <w:spacing w:before="60" w:line="276" w:lineRule="auto"/>
+              <w:ind w:left="201" w:right="89" w:hanging="283"/>
+              <w:rPr>
+                <w:rFonts w:ascii="Tahoma" w:eastAsia="Tahoma" w:hAnsi="Tahoma" w:cs="Tahoma"/>
+                <w:color w:val="000000"/>
+                <w:sz w:val="22"/>
+                <w:szCs w:val="22"/>
+              </w:rPr>
+            </w:pPr>
           </w:p>
         </w:tc>
         <w:tc>
@@ -1391,9 +1835,367 @@
             <w:tcW w:w="1850" w:type="dxa"/>
           </w:tcPr>
           <w:p>
+            <w:pPr>
+              <w:pBdr>
+                <w:top w:val="nil"/>
+                <w:left w:val="nil"/>
+                <w:bottom w:val="nil"/>
+                <w:right w:val="nil"/>
+                <w:between w:val="nil"/>
+              </w:pBdr>
+              <w:spacing w:before="60"/>
+              <w:jc w:val="center"/>
+              <w:rPr>
+                <w:rFonts w:ascii="Tahoma" w:eastAsia="Tahoma" w:hAnsi="Tahoma" w:cs="Tahoma"/>
+                <w:sz w:val="22"/>
+                <w:szCs w:val="22"/>
+              </w:rPr>
+            </w:pPr>
+          </w:p>
+        </w:tc>
+      </w:tr>
+      <w:tr>
+        <w:trPr>
+          <w:gridAfter w:val="1"/>
+          <w:wAfter w:w="10" w:type="dxa"/>
+          <w:trHeight w:val="306"/>
+        </w:trPr>
+        <w:tc>
+          <w:tcPr>
+            <w:tcW w:w="2665" w:type="dxa"/>
+            <w:gridSpan w:val="3"/>
+            <w:vAlign w:val="center"/>
+          </w:tcPr>
+          <w:p>
+            <w:pPr>
+              <w:pStyle w:val="ListParagraph"/>
+              <w:numPr>
+                <w:ilvl w:val="0"/>
+                <w:numId w:val="6"/>
+              </w:numPr>
+              <w:spacing w:before="120" w:after="120"/>
+              <w:ind w:left="436" w:hanging="426"/>
+              <w:jc w:val="both"/>
+              <w:rPr>
+                <w:rFonts w:ascii="Tahoma" w:eastAsia="Tahoma" w:hAnsi="Tahoma" w:cs="Tahoma"/>
+                <w:b/>
+              </w:rPr>
+            </w:pPr>
             <w:r>
-              <w:t>5 menit</w:t>
+              <w:rPr>
+                <w:rFonts w:ascii="Tahoma" w:eastAsia="Tahoma" w:hAnsi="Tahoma" w:cs="Tahoma"/>
+                <w:b/>
+              </w:rPr>
+              <w:t>Evaluasi</w:t>
             </w:r>
+          </w:p>
+        </w:tc>
+        <w:tc>
+          <w:tcPr>
+            <w:tcW w:w="3543" w:type="dxa"/>
+            <w:gridSpan w:val="2"/>
+          </w:tcPr>
+          <w:p>
+            <w:pPr>
+              <w:numPr>
+                <w:ilvl w:val="0"/>
+                <w:numId w:val="4"/>
+              </w:numPr>
+              <w:pBdr>
+                <w:top w:val="nil"/>
+                <w:left w:val="nil"/>
+                <w:bottom w:val="nil"/>
+                <w:right w:val="nil"/>
+                <w:between w:val="nil"/>
+              </w:pBdr>
+              <w:spacing w:before="60" w:line="276" w:lineRule="auto"/>
+              <w:ind w:left="201" w:right="89" w:hanging="335"/>
+              <w:rPr>
+                <w:rFonts w:ascii="Tahoma" w:eastAsia="Tahoma" w:hAnsi="Tahoma" w:cs="Tahoma"/>
+                <w:color w:val="000000"/>
+                <w:sz w:val="22"/>
+                <w:szCs w:val="22"/>
+              </w:rPr>
+            </w:pPr>
+          </w:p>
+        </w:tc>
+        <w:tc>
+          <w:tcPr>
+            <w:tcW w:w="1796" w:type="dxa"/>
+            <w:gridSpan w:val="3"/>
+          </w:tcPr>
+          <w:p>
+            <w:pPr>
+              <w:numPr>
+                <w:ilvl w:val="0"/>
+                <w:numId w:val="4"/>
+              </w:numPr>
+              <w:pBdr>
+                <w:top w:val="nil"/>
+                <w:left w:val="nil"/>
+                <w:bottom w:val="nil"/>
+                <w:right w:val="nil"/>
+                <w:between w:val="nil"/>
+              </w:pBdr>
+              <w:spacing w:before="60" w:line="276" w:lineRule="auto"/>
+              <w:ind w:left="253" w:right="89" w:hanging="220"/>
+              <w:rPr>
+                <w:rFonts w:ascii="Tahoma" w:eastAsia="Tahoma" w:hAnsi="Tahoma" w:cs="Tahoma"/>
+                <w:color w:val="000000"/>
+                <w:sz w:val="22"/>
+                <w:szCs w:val="22"/>
+              </w:rPr>
+            </w:pPr>
+          </w:p>
+        </w:tc>
+        <w:tc>
+          <w:tcPr>
+            <w:tcW w:w="1850" w:type="dxa"/>
+          </w:tcPr>
+          <w:p>
+            <w:pPr>
+              <w:pBdr>
+                <w:top w:val="nil"/>
+                <w:left w:val="nil"/>
+                <w:bottom w:val="nil"/>
+                <w:right w:val="nil"/>
+                <w:between w:val="nil"/>
+              </w:pBdr>
+              <w:spacing w:before="60"/>
+              <w:jc w:val="center"/>
+              <w:rPr>
+                <w:rFonts w:ascii="Tahoma" w:eastAsia="Tahoma" w:hAnsi="Tahoma" w:cs="Tahoma"/>
+                <w:sz w:val="22"/>
+                <w:szCs w:val="22"/>
+              </w:rPr>
+            </w:pPr>
+          </w:p>
+        </w:tc>
+      </w:tr>
+      <w:tr>
+        <w:trPr>
+          <w:gridAfter w:val="1"/>
+          <w:wAfter w:w="10" w:type="dxa"/>
+          <w:trHeight w:val="587"/>
+        </w:trPr>
+        <w:tc>
+          <w:tcPr>
+            <w:tcW w:w="2665" w:type="dxa"/>
+            <w:gridSpan w:val="3"/>
+            <w:vAlign w:val="center"/>
+          </w:tcPr>
+          <w:p>
+            <w:pPr>
+              <w:spacing w:before="120" w:after="120"/>
+              <w:jc w:val="both"/>
+              <w:rPr>
+                <w:rFonts w:ascii="Tahoma" w:eastAsia="Tahoma" w:hAnsi="Tahoma" w:cs="Tahoma"/>
+                <w:b/>
+                <w:sz w:val="22"/>
+                <w:szCs w:val="22"/>
+              </w:rPr>
+            </w:pPr>
+            <w:r>
+              <w:rPr>
+                <w:rFonts w:ascii="Tahoma" w:eastAsia="Tahoma" w:hAnsi="Tahoma" w:cs="Tahoma"/>
+                <w:b/>
+                <w:sz w:val="22"/>
+                <w:szCs w:val="22"/>
+              </w:rPr>
+              <w:t>Tugas Tambahan</w:t>
+            </w:r>
+          </w:p>
+        </w:tc>
+        <w:tc>
+          <w:tcPr>
+            <w:tcW w:w="3543" w:type="dxa"/>
+            <w:gridSpan w:val="2"/>
+          </w:tcPr>
+          <w:p>
+            <w:pPr>
+              <w:numPr>
+                <w:ilvl w:val="0"/>
+                <w:numId w:val="4"/>
+              </w:numPr>
+              <w:pBdr>
+                <w:top w:val="nil"/>
+                <w:left w:val="nil"/>
+                <w:bottom w:val="nil"/>
+                <w:right w:val="nil"/>
+                <w:between w:val="nil"/>
+              </w:pBdr>
+              <w:spacing w:before="60" w:line="276" w:lineRule="auto"/>
+              <w:ind w:left="253" w:right="89" w:hanging="220"/>
+              <w:rPr>
+                <w:rFonts w:ascii="Tahoma" w:eastAsia="Tahoma" w:hAnsi="Tahoma" w:cs="Tahoma"/>
+                <w:color w:val="000000"/>
+                <w:sz w:val="22"/>
+                <w:szCs w:val="22"/>
+              </w:rPr>
+            </w:pPr>
+          </w:p>
+        </w:tc>
+        <w:tc>
+          <w:tcPr>
+            <w:tcW w:w="1796" w:type="dxa"/>
+            <w:gridSpan w:val="3"/>
+          </w:tcPr>
+          <w:p>
+            <w:pPr>
+              <w:pBdr>
+                <w:top w:val="nil"/>
+                <w:left w:val="nil"/>
+                <w:bottom w:val="nil"/>
+                <w:right w:val="nil"/>
+                <w:between w:val="nil"/>
+              </w:pBdr>
+              <w:spacing w:before="60" w:line="276" w:lineRule="auto"/>
+              <w:ind w:left="33" w:right="89"/>
+              <w:rPr>
+                <w:rFonts w:ascii="Tahoma" w:eastAsia="Tahoma" w:hAnsi="Tahoma" w:cs="Tahoma"/>
+                <w:color w:val="000000"/>
+                <w:sz w:val="22"/>
+                <w:szCs w:val="22"/>
+              </w:rPr>
+            </w:pPr>
+          </w:p>
+        </w:tc>
+        <w:tc>
+          <w:tcPr>
+            <w:tcW w:w="1850" w:type="dxa"/>
+          </w:tcPr>
+          <w:p>
+            <w:pPr>
+              <w:pBdr>
+                <w:top w:val="nil"/>
+                <w:left w:val="nil"/>
+                <w:bottom w:val="nil"/>
+                <w:right w:val="nil"/>
+                <w:between w:val="nil"/>
+              </w:pBdr>
+              <w:spacing w:before="60"/>
+              <w:jc w:val="center"/>
+              <w:rPr>
+                <w:rFonts w:ascii="Tahoma" w:eastAsia="Tahoma" w:hAnsi="Tahoma" w:cs="Tahoma"/>
+                <w:sz w:val="22"/>
+                <w:szCs w:val="22"/>
+              </w:rPr>
+            </w:pPr>
+          </w:p>
+        </w:tc>
+      </w:tr>
+      <w:tr>
+        <w:trPr>
+          <w:gridAfter w:val="1"/>
+          <w:wAfter w:w="10" w:type="dxa"/>
+        </w:trPr>
+        <w:tc>
+          <w:tcPr>
+            <w:tcW w:w="2665" w:type="dxa"/>
+            <w:gridSpan w:val="3"/>
+            <w:vAlign w:val="center"/>
+          </w:tcPr>
+          <w:p>
+            <w:pPr>
+              <w:spacing w:before="120" w:after="120"/>
+              <w:jc w:val="both"/>
+              <w:rPr>
+                <w:rFonts w:ascii="Tahoma" w:eastAsia="Tahoma" w:hAnsi="Tahoma" w:cs="Tahoma"/>
+                <w:b/>
+                <w:sz w:val="22"/>
+                <w:szCs w:val="22"/>
+              </w:rPr>
+            </w:pPr>
+            <w:r>
+              <w:rPr>
+                <w:rFonts w:ascii="Tahoma" w:eastAsia="Tahoma" w:hAnsi="Tahoma" w:cs="Tahoma"/>
+                <w:b/>
+                <w:sz w:val="22"/>
+                <w:szCs w:val="22"/>
+              </w:rPr>
+              <w:t>Pemberesan Kelas</w:t>
+            </w:r>
+          </w:p>
+        </w:tc>
+        <w:tc>
+          <w:tcPr>
+            <w:tcW w:w="3543" w:type="dxa"/>
+            <w:gridSpan w:val="2"/>
+          </w:tcPr>
+          <w:p>
+            <w:pPr>
+              <w:numPr>
+                <w:ilvl w:val="0"/>
+                <w:numId w:val="4"/>
+              </w:numPr>
+              <w:pBdr>
+                <w:top w:val="nil"/>
+                <w:left w:val="nil"/>
+                <w:bottom w:val="nil"/>
+                <w:right w:val="nil"/>
+                <w:between w:val="nil"/>
+              </w:pBdr>
+              <w:spacing w:before="60" w:line="276" w:lineRule="auto"/>
+              <w:ind w:left="253" w:right="89" w:hanging="220"/>
+              <w:rPr>
+                <w:rFonts w:ascii="Tahoma" w:eastAsia="Tahoma" w:hAnsi="Tahoma" w:cs="Tahoma"/>
+                <w:color w:val="000000"/>
+                <w:sz w:val="22"/>
+                <w:szCs w:val="22"/>
+              </w:rPr>
+            </w:pPr>
+          </w:p>
+        </w:tc>
+        <w:tc>
+          <w:tcPr>
+            <w:tcW w:w="1796" w:type="dxa"/>
+            <w:gridSpan w:val="3"/>
+          </w:tcPr>
+          <w:p>
+            <w:pPr>
+              <w:numPr>
+                <w:ilvl w:val="0"/>
+                <w:numId w:val="4"/>
+              </w:numPr>
+              <w:pBdr>
+                <w:top w:val="nil"/>
+                <w:left w:val="nil"/>
+                <w:bottom w:val="nil"/>
+                <w:right w:val="nil"/>
+                <w:between w:val="nil"/>
+              </w:pBdr>
+              <w:spacing w:before="60" w:line="276" w:lineRule="auto"/>
+              <w:ind w:left="253" w:right="89" w:hanging="220"/>
+              <w:rPr>
+                <w:rFonts w:ascii="Tahoma" w:eastAsia="Tahoma" w:hAnsi="Tahoma" w:cs="Tahoma"/>
+                <w:color w:val="000000"/>
+                <w:sz w:val="22"/>
+                <w:szCs w:val="22"/>
+              </w:rPr>
+            </w:pPr>
+          </w:p>
+        </w:tc>
+        <w:tc>
+          <w:tcPr>
+            <w:tcW w:w="1850" w:type="dxa"/>
+          </w:tcPr>
+          <w:p>
+            <w:pPr>
+              <w:pBdr>
+                <w:top w:val="nil"/>
+                <w:left w:val="nil"/>
+                <w:bottom w:val="nil"/>
+                <w:right w:val="nil"/>
+                <w:between w:val="nil"/>
+              </w:pBdr>
+              <w:spacing w:before="60"/>
+              <w:jc w:val="center"/>
+              <w:rPr>
+                <w:rFonts w:ascii="Tahoma" w:eastAsia="Tahoma" w:hAnsi="Tahoma" w:cs="Tahoma"/>
+                <w:sz w:val="22"/>
+                <w:szCs w:val="22"/>
+              </w:rPr>
+            </w:pPr>
           </w:p>
         </w:tc>
       </w:tr>

</xml_diff>